<commit_message>
Khuzaima's contribution added to the report
</commit_message>
<xml_diff>
--- a/DM_MAA_Report.docx
+++ b/DM_MAA_Report.docx
@@ -1061,7 +1061,7 @@
         <w:rPr>
           <w:rtl w:val="0"/>
         </w:rPr>
-        <w:t xml:space="preserve">Student3 Name, 20003333</w:t>
+        <w:t xml:space="preserve">Muhammad Khuzaima Bashir, 20250441</w:t>
       </w:r>
     </w:p>
     <w:p>
@@ -1331,7 +1331,7 @@
     </w:p>
     <w:sdt>
       <w:sdtPr>
-        <w:id w:val="-2037217824"/>
+        <w:id w:val="-1623980519"/>
         <w:docPartObj>
           <w:docPartGallery w:val="Table of Contents"/>
           <w:docPartUnique w:val="1"/>
@@ -5242,12 +5242,12 @@
           <wp:inline distB="0" distT="0" distL="0" distR="0">
             <wp:extent cx="5759450" cy="5752465"/>
             <wp:effectExtent b="0" l="0" r="0" t="0"/>
-            <wp:docPr descr="Uma imagem com texto, diagrama, Paralelo, captura de ecrã&#10;&#10;Os conteúdos gerados por IA podem estar incorretos." id="5" name="image9.png"/>
+            <wp:docPr descr="Uma imagem com texto, diagrama, Paralelo, captura de ecrã&#10;&#10;Os conteúdos gerados por IA podem estar incorretos." id="5" name="image18.png"/>
             <a:graphic>
               <a:graphicData uri="http://schemas.openxmlformats.org/drawingml/2006/picture">
                 <pic:pic>
                   <pic:nvPicPr>
-                    <pic:cNvPr descr="Uma imagem com texto, diagrama, Paralelo, captura de ecrã&#10;&#10;Os conteúdos gerados por IA podem estar incorretos." id="0" name="image9.png"/>
+                    <pic:cNvPr descr="Uma imagem com texto, diagrama, Paralelo, captura de ecrã&#10;&#10;Os conteúdos gerados por IA podem estar incorretos." id="0" name="image18.png"/>
                     <pic:cNvPicPr preferRelativeResize="0"/>
                   </pic:nvPicPr>
                   <pic:blipFill>
@@ -5370,12 +5370,12 @@
           <wp:inline distB="0" distT="0" distL="0" distR="0">
             <wp:extent cx="5014348" cy="8414539"/>
             <wp:effectExtent b="0" l="0" r="0" t="0"/>
-            <wp:docPr descr="Uma imagem com captura de ecrã, Retângulo, diagrama, Paralelo&#10;&#10;Os conteúdos gerados por IA podem estar incorretos." id="7" name="image19.png"/>
+            <wp:docPr descr="Uma imagem com captura de ecrã, Retângulo, diagrama, Paralelo&#10;&#10;Os conteúdos gerados por IA podem estar incorretos." id="7" name="image3.png"/>
             <a:graphic>
               <a:graphicData uri="http://schemas.openxmlformats.org/drawingml/2006/picture">
                 <pic:pic>
                   <pic:nvPicPr>
-                    <pic:cNvPr descr="Uma imagem com captura de ecrã, Retângulo, diagrama, Paralelo&#10;&#10;Os conteúdos gerados por IA podem estar incorretos." id="0" name="image19.png"/>
+                    <pic:cNvPr descr="Uma imagem com captura de ecrã, Retângulo, diagrama, Paralelo&#10;&#10;Os conteúdos gerados por IA podem estar incorretos." id="0" name="image3.png"/>
                     <pic:cNvPicPr preferRelativeResize="0"/>
                   </pic:nvPicPr>
                   <pic:blipFill>
@@ -5428,12 +5428,12 @@
           <wp:inline distB="0" distT="0" distL="0" distR="0">
             <wp:extent cx="5715798" cy="7640116"/>
             <wp:effectExtent b="0" l="0" r="0" t="0"/>
-            <wp:docPr descr="A group of graphs showing different types of data&#10;&#10;AI-generated content may be incorrect." id="6" name="image10.png"/>
+            <wp:docPr descr="A group of graphs showing different types of data&#10;&#10;AI-generated content may be incorrect." id="6" name="image15.png"/>
             <a:graphic>
               <a:graphicData uri="http://schemas.openxmlformats.org/drawingml/2006/picture">
                 <pic:pic>
                   <pic:nvPicPr>
-                    <pic:cNvPr descr="A group of graphs showing different types of data&#10;&#10;AI-generated content may be incorrect." id="0" name="image10.png"/>
+                    <pic:cNvPr descr="A group of graphs showing different types of data&#10;&#10;AI-generated content may be incorrect." id="0" name="image15.png"/>
                     <pic:cNvPicPr preferRelativeResize="0"/>
                   </pic:nvPicPr>
                   <pic:blipFill>
@@ -5550,12 +5550,12 @@
           <wp:inline distB="0" distT="0" distL="0" distR="0">
             <wp:extent cx="5759450" cy="7697470"/>
             <wp:effectExtent b="0" l="0" r="0" t="0"/>
-            <wp:docPr descr="Uma imagem com texto, diagrama, Gráfico, captura de ecrã&#10;&#10;Os conteúdos gerados por IA podem estar incorretos." id="9" name="image11.png"/>
+            <wp:docPr descr="Uma imagem com texto, diagrama, Gráfico, captura de ecrã&#10;&#10;Os conteúdos gerados por IA podem estar incorretos." id="9" name="image20.png"/>
             <a:graphic>
               <a:graphicData uri="http://schemas.openxmlformats.org/drawingml/2006/picture">
                 <pic:pic>
                   <pic:nvPicPr>
-                    <pic:cNvPr descr="Uma imagem com texto, diagrama, Gráfico, captura de ecrã&#10;&#10;Os conteúdos gerados por IA podem estar incorretos." id="0" name="image11.png"/>
+                    <pic:cNvPr descr="Uma imagem com texto, diagrama, Gráfico, captura de ecrã&#10;&#10;Os conteúdos gerados por IA podem estar incorretos." id="0" name="image20.png"/>
                     <pic:cNvPicPr preferRelativeResize="0"/>
                   </pic:nvPicPr>
                   <pic:blipFill>
@@ -5766,12 +5766,12 @@
           <wp:inline distB="0" distT="0" distL="0" distR="0">
             <wp:extent cx="5759450" cy="3286760"/>
             <wp:effectExtent b="0" l="0" r="0" t="0"/>
-            <wp:docPr descr="A group of graphs with numbers and lines&#10;&#10;AI-generated content may be incorrect." id="11" name="image20.png"/>
+            <wp:docPr descr="A group of graphs with numbers and lines&#10;&#10;AI-generated content may be incorrect." id="11" name="image8.png"/>
             <a:graphic>
               <a:graphicData uri="http://schemas.openxmlformats.org/drawingml/2006/picture">
                 <pic:pic>
                   <pic:nvPicPr>
-                    <pic:cNvPr descr="A group of graphs with numbers and lines&#10;&#10;AI-generated content may be incorrect." id="0" name="image20.png"/>
+                    <pic:cNvPr descr="A group of graphs with numbers and lines&#10;&#10;AI-generated content may be incorrect." id="0" name="image8.png"/>
                     <pic:cNvPicPr preferRelativeResize="0"/>
                   </pic:nvPicPr>
                   <pic:blipFill>
@@ -5831,12 +5831,12 @@
           <wp:inline distB="0" distT="0" distL="0" distR="0">
             <wp:extent cx="5759450" cy="3275965"/>
             <wp:effectExtent b="0" l="0" r="0" t="0"/>
-            <wp:docPr descr="A screenshot of a graph&#10;&#10;AI-generated content may be incorrect." id="10" name="image15.png"/>
+            <wp:docPr descr="A screenshot of a graph&#10;&#10;AI-generated content may be incorrect." id="10" name="image21.png"/>
             <a:graphic>
               <a:graphicData uri="http://schemas.openxmlformats.org/drawingml/2006/picture">
                 <pic:pic>
                   <pic:nvPicPr>
-                    <pic:cNvPr descr="A screenshot of a graph&#10;&#10;AI-generated content may be incorrect." id="0" name="image15.png"/>
+                    <pic:cNvPr descr="A screenshot of a graph&#10;&#10;AI-generated content may be incorrect." id="0" name="image21.png"/>
                     <pic:cNvPicPr preferRelativeResize="0"/>
                   </pic:nvPicPr>
                   <pic:blipFill>
@@ -6275,12 +6275,12 @@
           <wp:inline distB="0" distT="0" distL="0" distR="0">
             <wp:extent cx="5759450" cy="5962650"/>
             <wp:effectExtent b="0" l="0" r="0" t="0"/>
-            <wp:docPr descr="A screenshot of a graph&#10;&#10;AI-generated content may be incorrect." id="13" name="image8.png"/>
+            <wp:docPr descr="A screenshot of a graph&#10;&#10;AI-generated content may be incorrect." id="13" name="image12.png"/>
             <a:graphic>
               <a:graphicData uri="http://schemas.openxmlformats.org/drawingml/2006/picture">
                 <pic:pic>
                   <pic:nvPicPr>
-                    <pic:cNvPr descr="A screenshot of a graph&#10;&#10;AI-generated content may be incorrect." id="0" name="image8.png"/>
+                    <pic:cNvPr descr="A screenshot of a graph&#10;&#10;AI-generated content may be incorrect." id="0" name="image12.png"/>
                     <pic:cNvPicPr preferRelativeResize="0"/>
                   </pic:nvPicPr>
                   <pic:blipFill>
@@ -6527,12 +6527,12 @@
           <wp:inline distB="0" distT="0" distL="0" distR="0">
             <wp:extent cx="5759450" cy="4950460"/>
             <wp:effectExtent b="0" l="0" r="0" t="0"/>
-            <wp:docPr descr="A screenshot of a graph&#10;&#10;AI-generated content may be incorrect." id="12" name="image17.png"/>
+            <wp:docPr descr="A screenshot of a graph&#10;&#10;AI-generated content may be incorrect." id="12" name="image7.png"/>
             <a:graphic>
               <a:graphicData uri="http://schemas.openxmlformats.org/drawingml/2006/picture">
                 <pic:pic>
                   <pic:nvPicPr>
-                    <pic:cNvPr descr="A screenshot of a graph&#10;&#10;AI-generated content may be incorrect." id="0" name="image17.png"/>
+                    <pic:cNvPr descr="A screenshot of a graph&#10;&#10;AI-generated content may be incorrect." id="0" name="image7.png"/>
                     <pic:cNvPicPr preferRelativeResize="0"/>
                   </pic:nvPicPr>
                   <pic:blipFill>
@@ -6709,12 +6709,12 @@
           <wp:inline distB="0" distT="0" distL="0" distR="0">
             <wp:extent cx="5759450" cy="5928360"/>
             <wp:effectExtent b="0" l="0" r="0" t="0"/>
-            <wp:docPr descr="A screenshot of a graph&#10;&#10;AI-generated content may be incorrect." id="16" name="image14.png"/>
+            <wp:docPr descr="A screenshot of a graph&#10;&#10;AI-generated content may be incorrect." id="16" name="image17.png"/>
             <a:graphic>
               <a:graphicData uri="http://schemas.openxmlformats.org/drawingml/2006/picture">
                 <pic:pic>
                   <pic:nvPicPr>
-                    <pic:cNvPr descr="A screenshot of a graph&#10;&#10;AI-generated content may be incorrect." id="0" name="image14.png"/>
+                    <pic:cNvPr descr="A screenshot of a graph&#10;&#10;AI-generated content may be incorrect." id="0" name="image17.png"/>
                     <pic:cNvPicPr preferRelativeResize="0"/>
                   </pic:nvPicPr>
                   <pic:blipFill>
@@ -6973,12 +6973,12 @@
           <wp:inline distB="0" distT="0" distL="0" distR="0">
             <wp:extent cx="5759450" cy="5045710"/>
             <wp:effectExtent b="0" l="0" r="0" t="0"/>
-            <wp:docPr descr="A screenshot of a computer screen&#10;&#10;AI-generated content may be incorrect." id="14" name="image3.png"/>
+            <wp:docPr descr="A screenshot of a computer screen&#10;&#10;AI-generated content may be incorrect." id="14" name="image4.png"/>
             <a:graphic>
               <a:graphicData uri="http://schemas.openxmlformats.org/drawingml/2006/picture">
                 <pic:pic>
                   <pic:nvPicPr>
-                    <pic:cNvPr descr="A screenshot of a computer screen&#10;&#10;AI-generated content may be incorrect." id="0" name="image3.png"/>
+                    <pic:cNvPr descr="A screenshot of a computer screen&#10;&#10;AI-generated content may be incorrect." id="0" name="image4.png"/>
                     <pic:cNvPicPr preferRelativeResize="0"/>
                   </pic:nvPicPr>
                   <pic:blipFill>
@@ -7057,12 +7057,12 @@
           <wp:inline distB="0" distT="0" distL="0" distR="0">
             <wp:extent cx="5759450" cy="1889760"/>
             <wp:effectExtent b="0" l="0" r="0" t="0"/>
-            <wp:docPr descr="A graph with a line going up&#10;&#10;AI-generated content may be incorrect." id="15" name="image5.png"/>
+            <wp:docPr descr="A graph with a line going up&#10;&#10;AI-generated content may be incorrect." id="15" name="image11.png"/>
             <a:graphic>
               <a:graphicData uri="http://schemas.openxmlformats.org/drawingml/2006/picture">
                 <pic:pic>
                   <pic:nvPicPr>
-                    <pic:cNvPr descr="A graph with a line going up&#10;&#10;AI-generated content may be incorrect." id="0" name="image5.png"/>
+                    <pic:cNvPr descr="A graph with a line going up&#10;&#10;AI-generated content may be incorrect." id="0" name="image11.png"/>
                     <pic:cNvPicPr preferRelativeResize="0"/>
                   </pic:nvPicPr>
                   <pic:blipFill>
@@ -7192,12 +7192,12 @@
           <wp:inline distB="0" distT="0" distL="0" distR="0">
             <wp:extent cx="4965509" cy="8537211"/>
             <wp:effectExtent b="0" l="0" r="0" t="0"/>
-            <wp:docPr descr="A group of colorful squares&#10;&#10;AI-generated content may be incorrect." id="17" name="image16.png"/>
+            <wp:docPr descr="A group of colorful squares&#10;&#10;AI-generated content may be incorrect." id="17" name="image13.png"/>
             <a:graphic>
               <a:graphicData uri="http://schemas.openxmlformats.org/drawingml/2006/picture">
                 <pic:pic>
                   <pic:nvPicPr>
-                    <pic:cNvPr descr="A group of colorful squares&#10;&#10;AI-generated content may be incorrect." id="0" name="image16.png"/>
+                    <pic:cNvPr descr="A group of colorful squares&#10;&#10;AI-generated content may be incorrect." id="0" name="image13.png"/>
                     <pic:cNvPicPr preferRelativeResize="0"/>
                   </pic:nvPicPr>
                   <pic:blipFill>
@@ -7276,12 +7276,12 @@
           <wp:inline distB="0" distT="0" distL="0" distR="0">
             <wp:extent cx="4892821" cy="8412240"/>
             <wp:effectExtent b="0" l="0" r="0" t="0"/>
-            <wp:docPr descr="A group of blue and orange bars&#10;&#10;AI-generated content may be incorrect." id="18" name="image1.png"/>
+            <wp:docPr descr="A group of blue and orange bars&#10;&#10;AI-generated content may be incorrect." id="18" name="image10.png"/>
             <a:graphic>
               <a:graphicData uri="http://schemas.openxmlformats.org/drawingml/2006/picture">
                 <pic:pic>
                   <pic:nvPicPr>
-                    <pic:cNvPr descr="A group of blue and orange bars&#10;&#10;AI-generated content may be incorrect." id="0" name="image1.png"/>
+                    <pic:cNvPr descr="A group of blue and orange bars&#10;&#10;AI-generated content may be incorrect." id="0" name="image10.png"/>
                     <pic:cNvPicPr preferRelativeResize="0"/>
                   </pic:nvPicPr>
                   <pic:blipFill>
@@ -7336,12 +7336,12 @@
           <wp:inline distB="0" distT="0" distL="0" distR="0">
             <wp:extent cx="5015661" cy="8623438"/>
             <wp:effectExtent b="0" l="0" r="0" t="0"/>
-            <wp:docPr descr="A group of colorful bars&#10;&#10;AI-generated content may be incorrect." id="19" name="image12.png"/>
+            <wp:docPr descr="A group of colorful bars&#10;&#10;AI-generated content may be incorrect." id="19" name="image9.png"/>
             <a:graphic>
               <a:graphicData uri="http://schemas.openxmlformats.org/drawingml/2006/picture">
                 <pic:pic>
                   <pic:nvPicPr>
-                    <pic:cNvPr descr="A group of colorful bars&#10;&#10;AI-generated content may be incorrect." id="0" name="image12.png"/>
+                    <pic:cNvPr descr="A group of colorful bars&#10;&#10;AI-generated content may be incorrect." id="0" name="image9.png"/>
                     <pic:cNvPicPr preferRelativeResize="0"/>
                   </pic:nvPicPr>
                   <pic:blipFill>
@@ -7398,12 +7398,12 @@
           <wp:inline distB="0" distT="0" distL="0" distR="0">
             <wp:extent cx="4886730" cy="8401767"/>
             <wp:effectExtent b="0" l="0" r="0" t="0"/>
-            <wp:docPr descr="A group of blue and orange bars&#10;&#10;AI-generated content may be incorrect." id="20" name="image4.png"/>
+            <wp:docPr descr="A group of blue and orange bars&#10;&#10;AI-generated content may be incorrect." id="20" name="image6.png"/>
             <a:graphic>
               <a:graphicData uri="http://schemas.openxmlformats.org/drawingml/2006/picture">
                 <pic:pic>
                   <pic:nvPicPr>
-                    <pic:cNvPr descr="A group of blue and orange bars&#10;&#10;AI-generated content may be incorrect." id="0" name="image4.png"/>
+                    <pic:cNvPr descr="A group of blue and orange bars&#10;&#10;AI-generated content may be incorrect." id="0" name="image6.png"/>
                     <pic:cNvPicPr preferRelativeResize="0"/>
                   </pic:nvPicPr>
                   <pic:blipFill>
@@ -7482,12 +7482,12 @@
           <wp:inline distB="0" distT="0" distL="0" distR="0">
             <wp:extent cx="5759450" cy="7693660"/>
             <wp:effectExtent b="0" l="0" r="0" t="0"/>
-            <wp:docPr descr="A screenshot of a graph&#10;&#10;AI-generated content may be incorrect." id="21" name="image24.png"/>
+            <wp:docPr descr="A screenshot of a graph&#10;&#10;AI-generated content may be incorrect." id="21" name="image14.png"/>
             <a:graphic>
               <a:graphicData uri="http://schemas.openxmlformats.org/drawingml/2006/picture">
                 <pic:pic>
                   <pic:nvPicPr>
-                    <pic:cNvPr descr="A screenshot of a graph&#10;&#10;AI-generated content may be incorrect." id="0" name="image24.png"/>
+                    <pic:cNvPr descr="A screenshot of a graph&#10;&#10;AI-generated content may be incorrect." id="0" name="image14.png"/>
                     <pic:cNvPicPr preferRelativeResize="0"/>
                   </pic:nvPicPr>
                   <pic:blipFill>
@@ -7764,12 +7764,12 @@
           <wp:inline distB="0" distT="0" distL="0" distR="0">
             <wp:extent cx="4255867" cy="3740189"/>
             <wp:effectExtent b="0" l="0" r="0" t="0"/>
-            <wp:docPr descr="A map of the united states&#10;&#10;AI-generated content may be incorrect." id="24" name="image21.png"/>
+            <wp:docPr descr="A map of the united states&#10;&#10;AI-generated content may be incorrect." id="24" name="image16.png"/>
             <a:graphic>
               <a:graphicData uri="http://schemas.openxmlformats.org/drawingml/2006/picture">
                 <pic:pic>
                   <pic:nvPicPr>
-                    <pic:cNvPr descr="A map of the united states&#10;&#10;AI-generated content may be incorrect." id="0" name="image21.png"/>
+                    <pic:cNvPr descr="A map of the united states&#10;&#10;AI-generated content may be incorrect." id="0" name="image16.png"/>
                     <pic:cNvPicPr preferRelativeResize="0"/>
                   </pic:nvPicPr>
                   <pic:blipFill>
@@ -7833,12 +7833,12 @@
           <wp:inline distB="0" distT="0" distL="0" distR="0">
             <wp:extent cx="4451177" cy="3888276"/>
             <wp:effectExtent b="0" l="0" r="0" t="0"/>
-            <wp:docPr descr="A map of the united states&#10;&#10;AI-generated content may be incorrect." id="1" name="image6.png"/>
+            <wp:docPr descr="A map of the united states&#10;&#10;AI-generated content may be incorrect." id="1" name="image1.png"/>
             <a:graphic>
               <a:graphicData uri="http://schemas.openxmlformats.org/drawingml/2006/picture">
                 <pic:pic>
                   <pic:nvPicPr>
-                    <pic:cNvPr descr="A map of the united states&#10;&#10;AI-generated content may be incorrect." id="0" name="image6.png"/>
+                    <pic:cNvPr descr="A map of the united states&#10;&#10;AI-generated content may be incorrect." id="0" name="image1.png"/>
                     <pic:cNvPicPr preferRelativeResize="0"/>
                   </pic:nvPicPr>
                   <pic:blipFill>
@@ -7889,12 +7889,12 @@
           <wp:inline distB="0" distT="0" distL="0" distR="0">
             <wp:extent cx="4431540" cy="3827152"/>
             <wp:effectExtent b="0" l="0" r="0" t="0"/>
-            <wp:docPr descr="A map of the united states&#10;&#10;AI-generated content may be incorrect." id="2" name="image13.png"/>
+            <wp:docPr descr="A map of the united states&#10;&#10;AI-generated content may be incorrect." id="2" name="image5.png"/>
             <a:graphic>
               <a:graphicData uri="http://schemas.openxmlformats.org/drawingml/2006/picture">
                 <pic:pic>
                   <pic:nvPicPr>
-                    <pic:cNvPr descr="A map of the united states&#10;&#10;AI-generated content may be incorrect." id="0" name="image13.png"/>
+                    <pic:cNvPr descr="A map of the united states&#10;&#10;AI-generated content may be incorrect." id="0" name="image5.png"/>
                     <pic:cNvPicPr preferRelativeResize="0"/>
                   </pic:nvPicPr>
                   <pic:blipFill>
@@ -7955,12 +7955,12 @@
           <wp:inline distB="0" distT="0" distL="0" distR="0">
             <wp:extent cx="4430932" cy="3955595"/>
             <wp:effectExtent b="0" l="0" r="0" t="0"/>
-            <wp:docPr descr="A map of canada with red and orange shades&#10;&#10;AI-generated content may be incorrect." id="3" name="image18.png"/>
+            <wp:docPr descr="A map of canada with red and orange shades&#10;&#10;AI-generated content may be incorrect." id="3" name="image24.png"/>
             <a:graphic>
               <a:graphicData uri="http://schemas.openxmlformats.org/drawingml/2006/picture">
                 <pic:pic>
                   <pic:nvPicPr>
-                    <pic:cNvPr descr="A map of canada with red and orange shades&#10;&#10;AI-generated content may be incorrect." id="0" name="image18.png"/>
+                    <pic:cNvPr descr="A map of canada with red and orange shades&#10;&#10;AI-generated content may be incorrect." id="0" name="image24.png"/>
                     <pic:cNvPicPr preferRelativeResize="0"/>
                   </pic:nvPicPr>
                   <pic:blipFill>
@@ -8011,12 +8011,12 @@
           <wp:inline distB="0" distT="0" distL="0" distR="0">
             <wp:extent cx="5759450" cy="5031105"/>
             <wp:effectExtent b="0" l="0" r="0" t="0"/>
-            <wp:docPr descr="A map of the united states&#10;&#10;AI-generated content may be incorrect." id="4" name="image7.png"/>
+            <wp:docPr descr="A map of the united states&#10;&#10;AI-generated content may be incorrect." id="4" name="image19.png"/>
             <a:graphic>
               <a:graphicData uri="http://schemas.openxmlformats.org/drawingml/2006/picture">
                 <pic:pic>
                   <pic:nvPicPr>
-                    <pic:cNvPr descr="A map of the united states&#10;&#10;AI-generated content may be incorrect." id="0" name="image7.png"/>
+                    <pic:cNvPr descr="A map of the united states&#10;&#10;AI-generated content may be incorrect." id="0" name="image19.png"/>
                     <pic:cNvPicPr preferRelativeResize="0"/>
                   </pic:nvPicPr>
                   <pic:blipFill>
@@ -8177,7 +8177,7 @@
         <w:rPr>
           <w:rtl w:val="0"/>
         </w:rPr>
-        <w:t xml:space="preserve">SampleStudent (StudentID:xxxxxxxx) -</w:t>
+        <w:t xml:space="preserve">Muhammad Khuzaima Bashir (StudentID: 20250441) - Customer and Flights initial separate and combined analysis, Poster</w:t>
       </w:r>
     </w:p>
     <w:p>

</xml_diff>